<commit_message>
Update resource data for 2026-09-28 release
</commit_message>
<xml_diff>
--- a/eng/docx/03.content.docx
+++ b/eng/docx/03.content.docx
@@ -235,7 +235,7 @@
         <w:rPr>
           <w:lang w:val="en_US" w:bidi="en_US"/>
         </w:rPr>
-        <w:t xml:space="preserve"> “Speak to the sons of Israel, and you shall say to them, ‘A man from you, when he presents an offering to Yahweh from the livestock— from the cattle or from the flock— you shall present your offering.</w:t>
+        <w:t xml:space="preserve"> “Speak to the sons of Israel, and you shall say to them, ‘A man from you, when he presents an offering to Yahweh from the livestock—from the cattle or from the flock—you shall present your offering.</w:t>
       </w:r>
     </w:p>
     <w:p>
@@ -403,7 +403,7 @@
         <w:rPr>
           <w:lang w:val="en_US" w:bidi="en_US"/>
         </w:rPr>
-        <w:t xml:space="preserve"> And if his offering from the flock— from the lambs or from the goats—{is} for a burnt offering, he shall present a perfect male.</w:t>
+        <w:t xml:space="preserve"> And if his offering from the flock—from the lambs or from the goats—{is} for a burnt offering, he shall present a perfect male.</w:t>
       </w:r>
     </w:p>
     <w:p>
@@ -1543,7 +1543,7 @@
         <w:rPr>
           <w:lang w:val="en_US" w:bidi="en_US"/>
         </w:rPr>
-        <w:t xml:space="preserve"> — and he shall bring out all of the bull to {a place} on the outside of the camp, to a clean place, to the pouring out place of the fatty ash. And he shall burn it on wood on the fire; on the pouring out place of the fatty ash, it shall be burned.</w:t>
+        <w:t xml:space="preserve"> —and he shall bring out all of the bull to {a place} on the outside of the camp, to a clean place, to the pouring out place of the fatty ash. And he shall burn it on wood on the fire; on the pouring out place of the fatty ash, it shall be burned.</w:t>
       </w:r>
     </w:p>
     <w:p>
@@ -2189,7 +2189,7 @@
         <w:rPr>
           <w:lang w:val="en_US" w:bidi="en_US"/>
         </w:rPr>
-        <w:t xml:space="preserve"> But if his hand does not reach the sufficiency of a sheep, then he shall bring his guilt offering because he sinned— two doves or two sons of a pigeon to Yahweh, one for a sin offering and one for a burnt offering.</w:t>
+        <w:t xml:space="preserve"> But if his hand does not reach the sufficiency of a sheep, then he shall bring his guilt offering because he sinned—two doves or two sons of a pigeon to Yahweh, one for a sin offering and one for a burnt offering.</w:t>
       </w:r>
     </w:p>
     <w:p>
@@ -11301,7 +11301,7 @@
         <w:rPr>
           <w:lang w:val="en_US" w:bidi="en_US"/>
         </w:rPr>
-        <w:t xml:space="preserve"> The nakedness of the daughter of your son or the daughter of your daughter— you shall not uncover their nakedness, for they {are} your nakedness.</w:t>
+        <w:t xml:space="preserve"> The nakedness of the daughter of your son or the daughter of your daughter—you shall not uncover their nakedness, for they {are} your nakedness.</w:t>
       </w:r>
     </w:p>
     <w:p>

</xml_diff>